<commit_message>
Removes unused document templates
Deletes redundant document templates related to 'garantia_mobiliaria' and 'reconocimiento_deuda' for female subjects, streamlining the legal document blueprints.
</commit_message>
<xml_diff>
--- a/apps/legal-docs-blueprints/templates/garantia_mobiliaria/garantia_mobiliaria-mujer.docx
+++ b/apps/legal-docs-blueprints/templates/garantia_mobiliaria/garantia_mobiliaria-mujer.docx
@@ -5077,21 +5077,30 @@
           <w:sz w:val="20"/>
           <w:szCs w:val="20"/>
         </w:rPr>
-        <w:t>NOMBRE</w:t>
-      </w:r>
-    </w:p>
-    <w:p>
-      <w:pPr>
-        <w:shd w:val="clear" w:color="auto" w:fill="FFFFFF"/>
-        <w:spacing w:after="160" w:line="360" w:lineRule="auto"/>
-        <w:jc w:val="both"/>
-        <w:rPr>
-          <w:rFonts w:ascii="Arial" w:eastAsia="Arial" w:hAnsi="Arial" w:cs="Arial"/>
+        <w:t>{</w:t>
+      </w:r>
+      <w:proofErr w:type="spellStart"/>
+      <w:r>
+        <w:rPr>
+          <w:rFonts w:ascii="Arial" w:eastAsia="Arial" w:hAnsi="Arial" w:cs="Arial"/>
+          <w:b/>
+          <w:color w:val="000000"/>
+          <w:sz w:val="20"/>
+          <w:szCs w:val="20"/>
+        </w:rPr>
+        <w:t>nombreCompleto</w:t>
+      </w:r>
+      <w:proofErr w:type="spellEnd"/>
+      <w:r>
+        <w:rPr>
+          <w:rFonts w:ascii="Arial" w:eastAsia="Arial" w:hAnsi="Arial" w:cs="Arial"/>
+          <w:b/>
           <w:color w:val="1A1A1A"/>
           <w:sz w:val="20"/>
           <w:szCs w:val="20"/>
         </w:rPr>
-      </w:pPr>
+        <w:t>}</w:t>
+      </w:r>
     </w:p>
     <w:p>
       <w:pPr>

</xml_diff>

<commit_message>
Removes redundant document templates
Removes duplicated document templates
across different gender versions.
</commit_message>
<xml_diff>
--- a/apps/legal-docs-blueprints/templates/garantia_mobiliaria/garantia_mobiliaria-mujer.docx
+++ b/apps/legal-docs-blueprints/templates/garantia_mobiliaria/garantia_mobiliaria-mujer.docx
@@ -1,6 +1,6 @@
 
 <file path=word/document.xml><?xml version="1.0" encoding="utf-8"?>
-<w:document xmlns:o="urn:schemas-microsoft-com:office:office" xmlns:r="http://schemas.openxmlformats.org/officeDocument/2006/relationships" xmlns:v="urn:schemas-microsoft-com:vml" xmlns:w="http://schemas.openxmlformats.org/wordprocessingml/2006/main" xmlns:w10="urn:schemas-microsoft-com:office:word" xmlns:wp="http://schemas.openxmlformats.org/drawingml/2006/wordprocessingDrawing" xmlns:pic="http://schemas.openxmlformats.org/drawingml/2006/picture" xmlns:wps="http://schemas.microsoft.com/office/word/2010/wordprocessingShape" xmlns:wpg="http://schemas.microsoft.com/office/word/2010/wordprocessingGroup" xmlns:mc="http://schemas.openxmlformats.org/markup-compatibility/2006" xmlns:wp14="http://schemas.microsoft.com/office/word/2010/wordprocessingDrawing" xmlns:w14="http://schemas.microsoft.com/office/word/2010/wordml" xmlns:w15="http://schemas.microsoft.com/office/word/2012/wordml" mc:Ignorable="w14 wp14 w15">
+<w:document xmlns:o="urn:schemas-microsoft-com:office:office" xmlns:r="http://schemas.openxmlformats.org/officeDocument/2006/relationships" xmlns:v="urn:schemas-microsoft-com:vml" xmlns:w="http://schemas.openxmlformats.org/wordprocessingml/2006/main" xmlns:w10="urn:schemas-microsoft-com:office:word" xmlns:wp="http://schemas.openxmlformats.org/drawingml/2006/wordprocessingDrawing" xmlns:wps="http://schemas.microsoft.com/office/word/2010/wordprocessingShape" xmlns:wpg="http://schemas.microsoft.com/office/word/2010/wordprocessingGroup" xmlns:mc="http://schemas.openxmlformats.org/markup-compatibility/2006" xmlns:wp14="http://schemas.microsoft.com/office/word/2010/wordprocessingDrawing" xmlns:w14="http://schemas.microsoft.com/office/word/2010/wordml" xmlns:w15="http://schemas.microsoft.com/office/word/2012/wordml" mc:Ignorable="w14 wp14 w15">
   <w:body>
     <w:p>
       <w:pPr>
@@ -2186,7 +2186,7 @@
         <w:pStyle w:val="Normal"/>
         <w:widowControl w:val="false"/>
         <w:spacing w:lineRule="auto" w:line="360"/>
-        <w:ind w:start="1416"/>
+        <w:ind w:left="1416"/>
         <w:jc w:val="both"/>
         <w:rPr>
           <w:rFonts w:ascii="Arial" w:hAnsi="Arial" w:eastAsia="Arial" w:cs="Arial"/>
@@ -2334,7 +2334,7 @@
         <w:pStyle w:val="Normal"/>
         <w:widowControl w:val="false"/>
         <w:spacing w:lineRule="auto" w:line="360"/>
-        <w:ind w:start="1416"/>
+        <w:ind w:left="1416"/>
         <w:jc w:val="both"/>
         <w:rPr>
           <w:rFonts w:ascii="Arial" w:hAnsi="Arial" w:eastAsia="Arial" w:cs="Arial"/>
@@ -2434,7 +2434,7 @@
         <w:pStyle w:val="Normal"/>
         <w:widowControl w:val="false"/>
         <w:spacing w:lineRule="auto" w:line="360"/>
-        <w:ind w:start="1416"/>
+        <w:ind w:left="1416"/>
         <w:jc w:val="both"/>
         <w:rPr>
           <w:rFonts w:ascii="Arial" w:hAnsi="Arial" w:eastAsia="Arial" w:cs="Arial"/>
@@ -2535,7 +2535,7 @@
         <w:pStyle w:val="Normal"/>
         <w:widowControl w:val="false"/>
         <w:spacing w:lineRule="auto" w:line="360"/>
-        <w:ind w:start="1416"/>
+        <w:ind w:left="1416"/>
         <w:jc w:val="both"/>
         <w:rPr>
           <w:rFonts w:ascii="Arial" w:hAnsi="Arial" w:eastAsia="Arial" w:cs="Arial"/>
@@ -2559,7 +2559,7 @@
         <w:pStyle w:val="Normal"/>
         <w:widowControl w:val="false"/>
         <w:spacing w:lineRule="auto" w:line="360"/>
-        <w:ind w:start="1416"/>
+        <w:ind w:left="1416"/>
         <w:jc w:val="both"/>
         <w:rPr>
           <w:rFonts w:ascii="Arial" w:hAnsi="Arial" w:eastAsia="Arial" w:cs="Arial"/>
@@ -2583,7 +2583,7 @@
         <w:pStyle w:val="Normal"/>
         <w:widowControl w:val="false"/>
         <w:spacing w:lineRule="auto" w:line="360"/>
-        <w:ind w:start="1416"/>
+        <w:ind w:left="1416"/>
         <w:jc w:val="both"/>
         <w:rPr>
           <w:rFonts w:ascii="Arial" w:hAnsi="Arial" w:eastAsia="Arial" w:cs="Arial"/>
@@ -2693,7 +2693,7 @@
         <w:pStyle w:val="Normal"/>
         <w:widowControl w:val="false"/>
         <w:spacing w:lineRule="auto" w:line="360"/>
-        <w:ind w:start="1416"/>
+        <w:ind w:left="1416"/>
         <w:jc w:val="both"/>
         <w:rPr>
           <w:rFonts w:ascii="Arial" w:hAnsi="Arial" w:eastAsia="Arial" w:cs="Arial"/>
@@ -3223,7 +3223,7 @@
         <w:pStyle w:val="Normal"/>
         <w:widowControl w:val="false"/>
         <w:spacing w:lineRule="auto" w:line="360"/>
-        <w:ind w:start="1068"/>
+        <w:ind w:left="1068"/>
         <w:jc w:val="both"/>
         <w:rPr>
           <w:rFonts w:ascii="Arial" w:hAnsi="Arial" w:eastAsia="Arial" w:cs="Arial"/>
@@ -3266,7 +3266,7 @@
         <w:pStyle w:val="Normal"/>
         <w:widowControl w:val="false"/>
         <w:spacing w:lineRule="auto" w:line="360"/>
-        <w:ind w:start="1068"/>
+        <w:ind w:left="1068"/>
         <w:jc w:val="both"/>
         <w:rPr>
           <w:rFonts w:ascii="Arial" w:hAnsi="Arial" w:eastAsia="Arial" w:cs="Arial"/>
@@ -3329,7 +3329,7 @@
         <w:pStyle w:val="Normal"/>
         <w:widowControl w:val="false"/>
         <w:spacing w:lineRule="auto" w:line="360"/>
-        <w:ind w:start="1068"/>
+        <w:ind w:left="1068"/>
         <w:jc w:val="both"/>
         <w:rPr>
           <w:rFonts w:ascii="Arial" w:hAnsi="Arial" w:eastAsia="Arial" w:cs="Arial"/>
@@ -3363,7 +3363,7 @@
         <w:pStyle w:val="Normal"/>
         <w:widowControl w:val="false"/>
         <w:spacing w:lineRule="auto" w:line="360"/>
-        <w:ind w:start="1068"/>
+        <w:ind w:left="1068"/>
         <w:jc w:val="both"/>
         <w:rPr>
           <w:rFonts w:ascii="Arial" w:hAnsi="Arial" w:eastAsia="Arial" w:cs="Arial"/>
@@ -3397,7 +3397,7 @@
         <w:pStyle w:val="Normal"/>
         <w:widowControl w:val="false"/>
         <w:spacing w:lineRule="auto" w:line="360"/>
-        <w:ind w:start="1068"/>
+        <w:ind w:left="1068"/>
         <w:jc w:val="both"/>
         <w:rPr>
           <w:rFonts w:ascii="Arial" w:hAnsi="Arial" w:eastAsia="Arial" w:cs="Arial"/>
@@ -3431,7 +3431,7 @@
         <w:pStyle w:val="Normal"/>
         <w:widowControl w:val="false"/>
         <w:spacing w:lineRule="auto" w:line="360"/>
-        <w:ind w:start="1068"/>
+        <w:ind w:left="1068"/>
         <w:jc w:val="both"/>
         <w:rPr>
           <w:rFonts w:ascii="Arial" w:hAnsi="Arial" w:eastAsia="Arial" w:cs="Arial"/>
@@ -3465,7 +3465,7 @@
         <w:pStyle w:val="Normal"/>
         <w:widowControl w:val="false"/>
         <w:spacing w:lineRule="auto" w:line="360"/>
-        <w:ind w:start="1068"/>
+        <w:ind w:left="1068"/>
         <w:jc w:val="both"/>
         <w:rPr>
           <w:rFonts w:ascii="Arial" w:hAnsi="Arial" w:eastAsia="Arial" w:cs="Arial"/>
@@ -3499,7 +3499,7 @@
         <w:pStyle w:val="Normal"/>
         <w:widowControl w:val="false"/>
         <w:spacing w:lineRule="auto" w:line="360"/>
-        <w:ind w:start="1068"/>
+        <w:ind w:left="1068"/>
         <w:jc w:val="both"/>
         <w:rPr>
           <w:rFonts w:ascii="Arial" w:hAnsi="Arial" w:eastAsia="Arial" w:cs="Arial"/>
@@ -4417,6 +4417,32 @@
       <w:pPr>
         <w:pStyle w:val="Normal"/>
         <w:widowControl w:val="false"/>
+        <w:tabs>
+          <w:tab w:val="clear" w:pos="720"/>
+          <w:tab w:val="left" w:pos="2268" w:leader="none"/>
+        </w:tabs>
+        <w:spacing w:lineRule="auto" w:line="360"/>
+        <w:jc w:val="both"/>
+        <w:rPr>
+          <w:rFonts w:ascii="Arial" w:hAnsi="Arial" w:eastAsia="Arial" w:cs="Arial"/>
+          <w:color w:val="000000"/>
+          <w:sz w:val="20"/>
+          <w:szCs w:val="20"/>
+        </w:rPr>
+      </w:pPr>
+      <w:r>
+        <w:rPr>
+          <w:rFonts w:eastAsia="Arial" w:cs="Arial" w:ascii="Arial" w:hAnsi="Arial"/>
+          <w:color w:val="000000"/>
+          <w:sz w:val="20"/>
+          <w:szCs w:val="20"/>
+        </w:rPr>
+      </w:r>
+    </w:p>
+    <w:p>
+      <w:pPr>
+        <w:pStyle w:val="Normal"/>
+        <w:widowControl w:val="false"/>
         <w:spacing w:lineRule="auto" w:line="360"/>
         <w:jc w:val="both"/>
         <w:rPr>
@@ -4700,7 +4726,7 @@
         <w:widowControl w:val="false"/>
         <w:shd w:val="clear" w:color="auto" w:fill="FFFFFF"/>
         <w:spacing w:lineRule="auto" w:line="523"/>
-        <w:ind w:start="560" w:end="280"/>
+        <w:ind w:left="560" w:right="280"/>
         <w:jc w:val="both"/>
         <w:rPr>
           <w:rFonts w:ascii="Arial" w:hAnsi="Arial" w:eastAsia="Arial" w:cs="Arial"/>
@@ -4725,7 +4751,7 @@
         <w:widowControl w:val="false"/>
         <w:shd w:val="clear" w:color="auto" w:fill="FFFFFF"/>
         <w:spacing w:lineRule="auto" w:line="523"/>
-        <w:ind w:end="280"/>
+        <w:ind w:right="280"/>
         <w:jc w:val="both"/>
         <w:rPr>
           <w:color w:val="000000"/>
@@ -4763,7 +4789,7 @@
 </file>
 
 <file path=word/footer1.xml><?xml version="1.0" encoding="utf-8"?>
-<w:ftr xmlns:o="urn:schemas-microsoft-com:office:office" xmlns:r="http://schemas.openxmlformats.org/officeDocument/2006/relationships" xmlns:v="urn:schemas-microsoft-com:vml" xmlns:w="http://schemas.openxmlformats.org/wordprocessingml/2006/main" xmlns:w10="urn:schemas-microsoft-com:office:word" xmlns:wp="http://schemas.openxmlformats.org/drawingml/2006/wordprocessingDrawing" xmlns:pic="http://schemas.openxmlformats.org/drawingml/2006/picture" xmlns:wps="http://schemas.microsoft.com/office/word/2010/wordprocessingShape" xmlns:wpg="http://schemas.microsoft.com/office/word/2010/wordprocessingGroup" xmlns:mc="http://schemas.openxmlformats.org/markup-compatibility/2006" xmlns:wp14="http://schemas.microsoft.com/office/word/2010/wordprocessingDrawing" xmlns:w14="http://schemas.microsoft.com/office/word/2010/wordml" xmlns:w15="http://schemas.microsoft.com/office/word/2012/wordml" mc:Ignorable="w14 wp14 w15">
+<w:ftr xmlns:o="urn:schemas-microsoft-com:office:office" xmlns:r="http://schemas.openxmlformats.org/officeDocument/2006/relationships" xmlns:v="urn:schemas-microsoft-com:vml" xmlns:w="http://schemas.openxmlformats.org/wordprocessingml/2006/main" xmlns:w10="urn:schemas-microsoft-com:office:word" xmlns:wp="http://schemas.openxmlformats.org/drawingml/2006/wordprocessingDrawing" xmlns:wps="http://schemas.microsoft.com/office/word/2010/wordprocessingShape" xmlns:wpg="http://schemas.microsoft.com/office/word/2010/wordprocessingGroup" xmlns:mc="http://schemas.openxmlformats.org/markup-compatibility/2006" xmlns:wp14="http://schemas.microsoft.com/office/word/2010/wordprocessingDrawing" xmlns:w14="http://schemas.microsoft.com/office/word/2010/wordml" xmlns:w15="http://schemas.microsoft.com/office/word/2012/wordml" mc:Ignorable="w14 wp14 w15">
   <w:p>
     <w:pPr>
       <w:pStyle w:val="Footer"/>
@@ -4777,7 +4803,7 @@
 </file>
 
 <file path=word/footer2.xml><?xml version="1.0" encoding="utf-8"?>
-<w:ftr xmlns:o="urn:schemas-microsoft-com:office:office" xmlns:r="http://schemas.openxmlformats.org/officeDocument/2006/relationships" xmlns:v="urn:schemas-microsoft-com:vml" xmlns:w="http://schemas.openxmlformats.org/wordprocessingml/2006/main" xmlns:w10="urn:schemas-microsoft-com:office:word" xmlns:wp="http://schemas.openxmlformats.org/drawingml/2006/wordprocessingDrawing" xmlns:pic="http://schemas.openxmlformats.org/drawingml/2006/picture" xmlns:wps="http://schemas.microsoft.com/office/word/2010/wordprocessingShape" xmlns:wpg="http://schemas.microsoft.com/office/word/2010/wordprocessingGroup" xmlns:mc="http://schemas.openxmlformats.org/markup-compatibility/2006" xmlns:wp14="http://schemas.microsoft.com/office/word/2010/wordprocessingDrawing" xmlns:w14="http://schemas.microsoft.com/office/word/2010/wordml" xmlns:w15="http://schemas.microsoft.com/office/word/2012/wordml" mc:Ignorable="w14 wp14 w15">
+<w:ftr xmlns:o="urn:schemas-microsoft-com:office:office" xmlns:r="http://schemas.openxmlformats.org/officeDocument/2006/relationships" xmlns:v="urn:schemas-microsoft-com:vml" xmlns:w="http://schemas.openxmlformats.org/wordprocessingml/2006/main" xmlns:w10="urn:schemas-microsoft-com:office:word" xmlns:wp="http://schemas.openxmlformats.org/drawingml/2006/wordprocessingDrawing" xmlns:wps="http://schemas.microsoft.com/office/word/2010/wordprocessingShape" xmlns:wpg="http://schemas.microsoft.com/office/word/2010/wordprocessingGroup" xmlns:mc="http://schemas.openxmlformats.org/markup-compatibility/2006" xmlns:wp14="http://schemas.microsoft.com/office/word/2010/wordprocessingDrawing" xmlns:w14="http://schemas.microsoft.com/office/word/2010/wordml" xmlns:w15="http://schemas.microsoft.com/office/word/2012/wordml" mc:Ignorable="w14 wp14 w15">
   <w:p>
     <w:pPr>
       <w:pStyle w:val="Normal"/>
@@ -4788,7 +4814,7 @@
         <w:tab w:val="right" w:pos="8838" w:leader="none"/>
       </w:tabs>
       <w:spacing w:lineRule="auto" w:line="480"/>
-      <w:jc w:val="end"/>
+      <w:jc w:val="right"/>
       <w:rPr>
         <w:color w:val="000000"/>
         <w:sz w:val="20"/>
@@ -4842,7 +4868,7 @@
         <w:rFonts w:eastAsia="Quattrocento Sans" w:cs="Quattrocento Sans" w:ascii="Quattrocento Sans" w:hAnsi="Quattrocento Sans"/>
         <w:color w:val="000000"/>
       </w:rPr>
-      <w:t>7</w:t>
+      <w:t>8</w:t>
     </w:r>
     <w:r>
       <w:rPr>
@@ -4918,7 +4944,7 @@
 </file>
 
 <file path=word/footer3.xml><?xml version="1.0" encoding="utf-8"?>
-<w:ftr xmlns:o="urn:schemas-microsoft-com:office:office" xmlns:r="http://schemas.openxmlformats.org/officeDocument/2006/relationships" xmlns:v="urn:schemas-microsoft-com:vml" xmlns:w="http://schemas.openxmlformats.org/wordprocessingml/2006/main" xmlns:w10="urn:schemas-microsoft-com:office:word" xmlns:wp="http://schemas.openxmlformats.org/drawingml/2006/wordprocessingDrawing" xmlns:pic="http://schemas.openxmlformats.org/drawingml/2006/picture" xmlns:wps="http://schemas.microsoft.com/office/word/2010/wordprocessingShape" xmlns:wpg="http://schemas.microsoft.com/office/word/2010/wordprocessingGroup" xmlns:mc="http://schemas.openxmlformats.org/markup-compatibility/2006" xmlns:wp14="http://schemas.microsoft.com/office/word/2010/wordprocessingDrawing" xmlns:w14="http://schemas.microsoft.com/office/word/2010/wordml" xmlns:w15="http://schemas.microsoft.com/office/word/2012/wordml" mc:Ignorable="w14 wp14 w15">
+<w:ftr xmlns:o="urn:schemas-microsoft-com:office:office" xmlns:r="http://schemas.openxmlformats.org/officeDocument/2006/relationships" xmlns:v="urn:schemas-microsoft-com:vml" xmlns:w="http://schemas.openxmlformats.org/wordprocessingml/2006/main" xmlns:w10="urn:schemas-microsoft-com:office:word" xmlns:wp="http://schemas.openxmlformats.org/drawingml/2006/wordprocessingDrawing" xmlns:wps="http://schemas.microsoft.com/office/word/2010/wordprocessingShape" xmlns:wpg="http://schemas.microsoft.com/office/word/2010/wordprocessingGroup" xmlns:mc="http://schemas.openxmlformats.org/markup-compatibility/2006" xmlns:wp14="http://schemas.microsoft.com/office/word/2010/wordprocessingDrawing" xmlns:w14="http://schemas.microsoft.com/office/word/2010/wordml" xmlns:w15="http://schemas.microsoft.com/office/word/2012/wordml" mc:Ignorable="w14 wp14 w15">
   <w:p>
     <w:pPr>
       <w:pStyle w:val="Normal"/>
@@ -4929,7 +4955,7 @@
         <w:tab w:val="right" w:pos="8838" w:leader="none"/>
       </w:tabs>
       <w:spacing w:lineRule="auto" w:line="480"/>
-      <w:jc w:val="end"/>
+      <w:jc w:val="right"/>
       <w:rPr>
         <w:color w:val="000000"/>
         <w:sz w:val="20"/>
@@ -4983,7 +5009,7 @@
         <w:rFonts w:eastAsia="Quattrocento Sans" w:cs="Quattrocento Sans" w:ascii="Quattrocento Sans" w:hAnsi="Quattrocento Sans"/>
         <w:color w:val="000000"/>
       </w:rPr>
-      <w:t>7</w:t>
+      <w:t>8</w:t>
     </w:r>
     <w:r>
       <w:rPr>
@@ -5059,7 +5085,7 @@
 </file>
 
 <file path=word/header1.xml><?xml version="1.0" encoding="utf-8"?>
-<w:hdr xmlns:o="urn:schemas-microsoft-com:office:office" xmlns:r="http://schemas.openxmlformats.org/officeDocument/2006/relationships" xmlns:v="urn:schemas-microsoft-com:vml" xmlns:w="http://schemas.openxmlformats.org/wordprocessingml/2006/main" xmlns:w10="urn:schemas-microsoft-com:office:word" xmlns:wp="http://schemas.openxmlformats.org/drawingml/2006/wordprocessingDrawing" xmlns:pic="http://schemas.openxmlformats.org/drawingml/2006/picture" xmlns:wps="http://schemas.microsoft.com/office/word/2010/wordprocessingShape" xmlns:wpg="http://schemas.microsoft.com/office/word/2010/wordprocessingGroup" xmlns:mc="http://schemas.openxmlformats.org/markup-compatibility/2006" xmlns:wp14="http://schemas.microsoft.com/office/word/2010/wordprocessingDrawing" xmlns:w14="http://schemas.microsoft.com/office/word/2010/wordml" xmlns:w15="http://schemas.microsoft.com/office/word/2012/wordml" mc:Ignorable="w14 wp14 w15">
+<w:hdr xmlns:o="urn:schemas-microsoft-com:office:office" xmlns:r="http://schemas.openxmlformats.org/officeDocument/2006/relationships" xmlns:v="urn:schemas-microsoft-com:vml" xmlns:w="http://schemas.openxmlformats.org/wordprocessingml/2006/main" xmlns:w10="urn:schemas-microsoft-com:office:word" xmlns:wp="http://schemas.openxmlformats.org/drawingml/2006/wordprocessingDrawing" xmlns:wps="http://schemas.microsoft.com/office/word/2010/wordprocessingShape" xmlns:wpg="http://schemas.microsoft.com/office/word/2010/wordprocessingGroup" xmlns:mc="http://schemas.openxmlformats.org/markup-compatibility/2006" xmlns:wp14="http://schemas.microsoft.com/office/word/2010/wordprocessingDrawing" xmlns:w14="http://schemas.microsoft.com/office/word/2010/wordml" xmlns:w15="http://schemas.microsoft.com/office/word/2012/wordml" mc:Ignorable="w14 wp14 w15">
   <w:p>
     <w:pPr>
       <w:pStyle w:val="Header"/>
@@ -5073,7 +5099,7 @@
 </file>
 
 <file path=word/header2.xml><?xml version="1.0" encoding="utf-8"?>
-<w:hdr xmlns:o="urn:schemas-microsoft-com:office:office" xmlns:r="http://schemas.openxmlformats.org/officeDocument/2006/relationships" xmlns:v="urn:schemas-microsoft-com:vml" xmlns:w="http://schemas.openxmlformats.org/wordprocessingml/2006/main" xmlns:w10="urn:schemas-microsoft-com:office:word" xmlns:wp="http://schemas.openxmlformats.org/drawingml/2006/wordprocessingDrawing" xmlns:pic="http://schemas.openxmlformats.org/drawingml/2006/picture" xmlns:wps="http://schemas.microsoft.com/office/word/2010/wordprocessingShape" xmlns:wpg="http://schemas.microsoft.com/office/word/2010/wordprocessingGroup" xmlns:mc="http://schemas.openxmlformats.org/markup-compatibility/2006" xmlns:wp14="http://schemas.microsoft.com/office/word/2010/wordprocessingDrawing" xmlns:w14="http://schemas.microsoft.com/office/word/2010/wordml" xmlns:w15="http://schemas.microsoft.com/office/word/2012/wordml" mc:Ignorable="w14 wp14 w15">
+<w:hdr xmlns:o="urn:schemas-microsoft-com:office:office" xmlns:r="http://schemas.openxmlformats.org/officeDocument/2006/relationships" xmlns:v="urn:schemas-microsoft-com:vml" xmlns:w="http://schemas.openxmlformats.org/wordprocessingml/2006/main" xmlns:w10="urn:schemas-microsoft-com:office:word" xmlns:wp="http://schemas.openxmlformats.org/drawingml/2006/wordprocessingDrawing" xmlns:wps="http://schemas.microsoft.com/office/word/2010/wordprocessingShape" xmlns:wpg="http://schemas.microsoft.com/office/word/2010/wordprocessingGroup" xmlns:mc="http://schemas.openxmlformats.org/markup-compatibility/2006" xmlns:wp14="http://schemas.microsoft.com/office/word/2010/wordprocessingDrawing" xmlns:w14="http://schemas.microsoft.com/office/word/2010/wordml" xmlns:w15="http://schemas.microsoft.com/office/word/2012/wordml" mc:Ignorable="w14 wp14 w15">
   <w:p>
     <w:pPr>
       <w:pStyle w:val="Normal"/>
@@ -5097,7 +5123,7 @@
 </file>
 
 <file path=word/header3.xml><?xml version="1.0" encoding="utf-8"?>
-<w:hdr xmlns:o="urn:schemas-microsoft-com:office:office" xmlns:r="http://schemas.openxmlformats.org/officeDocument/2006/relationships" xmlns:v="urn:schemas-microsoft-com:vml" xmlns:w="http://schemas.openxmlformats.org/wordprocessingml/2006/main" xmlns:w10="urn:schemas-microsoft-com:office:word" xmlns:wp="http://schemas.openxmlformats.org/drawingml/2006/wordprocessingDrawing" xmlns:pic="http://schemas.openxmlformats.org/drawingml/2006/picture" xmlns:wps="http://schemas.microsoft.com/office/word/2010/wordprocessingShape" xmlns:wpg="http://schemas.microsoft.com/office/word/2010/wordprocessingGroup" xmlns:mc="http://schemas.openxmlformats.org/markup-compatibility/2006" xmlns:wp14="http://schemas.microsoft.com/office/word/2010/wordprocessingDrawing" xmlns:w14="http://schemas.microsoft.com/office/word/2010/wordml" xmlns:w15="http://schemas.microsoft.com/office/word/2012/wordml" mc:Ignorable="w14 wp14 w15">
+<w:hdr xmlns:o="urn:schemas-microsoft-com:office:office" xmlns:r="http://schemas.openxmlformats.org/officeDocument/2006/relationships" xmlns:v="urn:schemas-microsoft-com:vml" xmlns:w="http://schemas.openxmlformats.org/wordprocessingml/2006/main" xmlns:w10="urn:schemas-microsoft-com:office:word" xmlns:wp="http://schemas.openxmlformats.org/drawingml/2006/wordprocessingDrawing" xmlns:wps="http://schemas.microsoft.com/office/word/2010/wordprocessingShape" xmlns:wpg="http://schemas.microsoft.com/office/word/2010/wordprocessingGroup" xmlns:mc="http://schemas.openxmlformats.org/markup-compatibility/2006" xmlns:wp14="http://schemas.microsoft.com/office/word/2010/wordprocessingDrawing" xmlns:w14="http://schemas.microsoft.com/office/word/2010/wordml" xmlns:w15="http://schemas.microsoft.com/office/word/2012/wordml" mc:Ignorable="w14 wp14 w15">
   <w:p>
     <w:pPr>
       <w:pStyle w:val="Normal"/>
@@ -5127,12 +5153,12 @@
       <w:start w:val="1"/>
       <w:numFmt w:val="lowerLetter"/>
       <w:lvlText w:val="%1)"/>
-      <w:lvlJc w:val="start"/>
+      <w:lvlJc w:val="left"/>
       <w:pPr>
         <w:tabs>
           <w:tab w:val="num" w:pos="0"/>
         </w:tabs>
-        <w:ind w:start="360" w:hanging="360"/>
+        <w:ind w:left="360" w:hanging="360"/>
       </w:pPr>
       <w:rPr>
         <w:smallCaps w:val="false"/>
@@ -5149,12 +5175,12 @@
       <w:start w:val="1"/>
       <w:numFmt w:val="lowerLetter"/>
       <w:lvlText w:val="%2."/>
-      <w:lvlJc w:val="start"/>
+      <w:lvlJc w:val="left"/>
       <w:pPr>
         <w:tabs>
           <w:tab w:val="num" w:pos="0"/>
         </w:tabs>
-        <w:ind w:start="1080" w:hanging="360"/>
+        <w:ind w:left="1080" w:hanging="360"/>
       </w:pPr>
       <w:rPr>
         <w:smallCaps w:val="false"/>
@@ -5171,12 +5197,12 @@
       <w:start w:val="1"/>
       <w:numFmt w:val="lowerRoman"/>
       <w:lvlText w:val="%3."/>
-      <w:lvlJc w:val="start"/>
+      <w:lvlJc w:val="left"/>
       <w:pPr>
         <w:tabs>
           <w:tab w:val="num" w:pos="0"/>
         </w:tabs>
-        <w:ind w:start="1800" w:hanging="291"/>
+        <w:ind w:left="1800" w:hanging="291"/>
       </w:pPr>
       <w:rPr>
         <w:smallCaps w:val="false"/>
@@ -5193,12 +5219,12 @@
       <w:start w:val="1"/>
       <w:numFmt w:val="decimal"/>
       <w:lvlText w:val="%4."/>
-      <w:lvlJc w:val="start"/>
+      <w:lvlJc w:val="left"/>
       <w:pPr>
         <w:tabs>
           <w:tab w:val="num" w:pos="0"/>
         </w:tabs>
-        <w:ind w:start="2520" w:hanging="360"/>
+        <w:ind w:left="2520" w:hanging="360"/>
       </w:pPr>
       <w:rPr>
         <w:smallCaps w:val="false"/>
@@ -5215,12 +5241,12 @@
       <w:start w:val="1"/>
       <w:numFmt w:val="lowerLetter"/>
       <w:lvlText w:val="%5."/>
-      <w:lvlJc w:val="start"/>
+      <w:lvlJc w:val="left"/>
       <w:pPr>
         <w:tabs>
           <w:tab w:val="num" w:pos="0"/>
         </w:tabs>
-        <w:ind w:start="3240" w:hanging="360"/>
+        <w:ind w:left="3240" w:hanging="360"/>
       </w:pPr>
       <w:rPr>
         <w:smallCaps w:val="false"/>
@@ -5237,12 +5263,12 @@
       <w:start w:val="1"/>
       <w:numFmt w:val="lowerRoman"/>
       <w:lvlText w:val="%6."/>
-      <w:lvlJc w:val="start"/>
+      <w:lvlJc w:val="left"/>
       <w:pPr>
         <w:tabs>
           <w:tab w:val="num" w:pos="0"/>
         </w:tabs>
-        <w:ind w:start="3960" w:hanging="291"/>
+        <w:ind w:left="3960" w:hanging="291"/>
       </w:pPr>
       <w:rPr>
         <w:smallCaps w:val="false"/>
@@ -5259,12 +5285,12 @@
       <w:start w:val="1"/>
       <w:numFmt w:val="decimal"/>
       <w:lvlText w:val="%7."/>
-      <w:lvlJc w:val="start"/>
+      <w:lvlJc w:val="left"/>
       <w:pPr>
         <w:tabs>
           <w:tab w:val="num" w:pos="0"/>
         </w:tabs>
-        <w:ind w:start="4680" w:hanging="360"/>
+        <w:ind w:left="4680" w:hanging="360"/>
       </w:pPr>
       <w:rPr>
         <w:smallCaps w:val="false"/>
@@ -5281,12 +5307,12 @@
       <w:start w:val="1"/>
       <w:numFmt w:val="lowerLetter"/>
       <w:lvlText w:val="%8."/>
-      <w:lvlJc w:val="start"/>
+      <w:lvlJc w:val="left"/>
       <w:pPr>
         <w:tabs>
           <w:tab w:val="num" w:pos="0"/>
         </w:tabs>
-        <w:ind w:start="5400" w:hanging="360"/>
+        <w:ind w:left="5400" w:hanging="360"/>
       </w:pPr>
       <w:rPr>
         <w:smallCaps w:val="false"/>
@@ -5303,12 +5329,12 @@
       <w:start w:val="1"/>
       <w:numFmt w:val="lowerRoman"/>
       <w:lvlText w:val="%9."/>
-      <w:lvlJc w:val="start"/>
+      <w:lvlJc w:val="left"/>
       <w:pPr>
         <w:tabs>
           <w:tab w:val="num" w:pos="0"/>
         </w:tabs>
-        <w:ind w:start="6120" w:hanging="291"/>
+        <w:ind w:left="6120" w:hanging="291"/>
       </w:pPr>
       <w:rPr>
         <w:smallCaps w:val="false"/>
@@ -5327,12 +5353,12 @@
       <w:start w:val="1"/>
       <w:numFmt w:val="lowerLetter"/>
       <w:lvlText w:val="%1)"/>
-      <w:lvlJc w:val="start"/>
+      <w:lvlJc w:val="left"/>
       <w:pPr>
         <w:tabs>
           <w:tab w:val="num" w:pos="0"/>
         </w:tabs>
-        <w:ind w:start="1068" w:hanging="360"/>
+        <w:ind w:left="1068" w:hanging="360"/>
       </w:pPr>
       <w:rPr>
         <w:smallCaps w:val="false"/>
@@ -5349,12 +5375,12 @@
       <w:start w:val="1"/>
       <w:numFmt w:val="lowerLetter"/>
       <w:lvlText w:val="%2."/>
-      <w:lvlJc w:val="start"/>
+      <w:lvlJc w:val="left"/>
       <w:pPr>
         <w:tabs>
           <w:tab w:val="num" w:pos="0"/>
         </w:tabs>
-        <w:ind w:start="1788" w:hanging="360"/>
+        <w:ind w:left="1788" w:hanging="360"/>
       </w:pPr>
       <w:rPr>
         <w:smallCaps w:val="false"/>
@@ -5371,12 +5397,12 @@
       <w:start w:val="1"/>
       <w:numFmt w:val="lowerRoman"/>
       <w:lvlText w:val="%3."/>
-      <w:lvlJc w:val="start"/>
+      <w:lvlJc w:val="left"/>
       <w:pPr>
         <w:tabs>
           <w:tab w:val="num" w:pos="0"/>
         </w:tabs>
-        <w:ind w:start="2508" w:hanging="291"/>
+        <w:ind w:left="2508" w:hanging="291"/>
       </w:pPr>
       <w:rPr>
         <w:smallCaps w:val="false"/>
@@ -5393,12 +5419,12 @@
       <w:start w:val="1"/>
       <w:numFmt w:val="decimal"/>
       <w:lvlText w:val="%4."/>
-      <w:lvlJc w:val="start"/>
+      <w:lvlJc w:val="left"/>
       <w:pPr>
         <w:tabs>
           <w:tab w:val="num" w:pos="0"/>
         </w:tabs>
-        <w:ind w:start="3228" w:hanging="360"/>
+        <w:ind w:left="3228" w:hanging="360"/>
       </w:pPr>
       <w:rPr>
         <w:smallCaps w:val="false"/>
@@ -5415,12 +5441,12 @@
       <w:start w:val="1"/>
       <w:numFmt w:val="lowerLetter"/>
       <w:lvlText w:val="%5."/>
-      <w:lvlJc w:val="start"/>
+      <w:lvlJc w:val="left"/>
       <w:pPr>
         <w:tabs>
           <w:tab w:val="num" w:pos="0"/>
         </w:tabs>
-        <w:ind w:start="3948" w:hanging="360"/>
+        <w:ind w:left="3948" w:hanging="360"/>
       </w:pPr>
       <w:rPr>
         <w:smallCaps w:val="false"/>
@@ -5437,12 +5463,12 @@
       <w:start w:val="1"/>
       <w:numFmt w:val="lowerRoman"/>
       <w:lvlText w:val="%6."/>
-      <w:lvlJc w:val="start"/>
+      <w:lvlJc w:val="left"/>
       <w:pPr>
         <w:tabs>
           <w:tab w:val="num" w:pos="0"/>
         </w:tabs>
-        <w:ind w:start="4668" w:hanging="291"/>
+        <w:ind w:left="4668" w:hanging="291"/>
       </w:pPr>
       <w:rPr>
         <w:smallCaps w:val="false"/>
@@ -5459,12 +5485,12 @@
       <w:start w:val="1"/>
       <w:numFmt w:val="decimal"/>
       <w:lvlText w:val="%7."/>
-      <w:lvlJc w:val="start"/>
+      <w:lvlJc w:val="left"/>
       <w:pPr>
         <w:tabs>
           <w:tab w:val="num" w:pos="0"/>
         </w:tabs>
-        <w:ind w:start="5388" w:hanging="360"/>
+        <w:ind w:left="5388" w:hanging="360"/>
       </w:pPr>
       <w:rPr>
         <w:smallCaps w:val="false"/>
@@ -5481,12 +5507,12 @@
       <w:start w:val="1"/>
       <w:numFmt w:val="lowerLetter"/>
       <w:lvlText w:val="%8."/>
-      <w:lvlJc w:val="start"/>
+      <w:lvlJc w:val="left"/>
       <w:pPr>
         <w:tabs>
           <w:tab w:val="num" w:pos="0"/>
         </w:tabs>
-        <w:ind w:start="6108" w:hanging="360"/>
+        <w:ind w:left="6108" w:hanging="360"/>
       </w:pPr>
       <w:rPr>
         <w:smallCaps w:val="false"/>
@@ -5503,12 +5529,12 @@
       <w:start w:val="1"/>
       <w:numFmt w:val="lowerRoman"/>
       <w:lvlText w:val="%9."/>
-      <w:lvlJc w:val="start"/>
+      <w:lvlJc w:val="left"/>
       <w:pPr>
         <w:tabs>
           <w:tab w:val="num" w:pos="0"/>
         </w:tabs>
-        <w:ind w:start="6828" w:hanging="291"/>
+        <w:ind w:left="6828" w:hanging="291"/>
       </w:pPr>
       <w:rPr>
         <w:smallCaps w:val="false"/>
@@ -5528,12 +5554,12 @@
       <w:numFmt w:val="none"/>
       <w:suff w:val="nothing"/>
       <w:lvlText w:val=""/>
-      <w:lvlJc w:val="start"/>
+      <w:lvlJc w:val="left"/>
       <w:pPr>
         <w:tabs>
           <w:tab w:val="num" w:pos="0"/>
         </w:tabs>
-        <w:ind w:start="0" w:hanging="0"/>
+        <w:ind w:left="0" w:hanging="0"/>
       </w:pPr>
     </w:lvl>
     <w:lvl w:ilvl="1">
@@ -5541,12 +5567,12 @@
       <w:numFmt w:val="none"/>
       <w:suff w:val="nothing"/>
       <w:lvlText w:val=""/>
-      <w:lvlJc w:val="start"/>
+      <w:lvlJc w:val="left"/>
       <w:pPr>
         <w:tabs>
           <w:tab w:val="num" w:pos="0"/>
         </w:tabs>
-        <w:ind w:start="0" w:hanging="0"/>
+        <w:ind w:left="0" w:hanging="0"/>
       </w:pPr>
     </w:lvl>
     <w:lvl w:ilvl="2">
@@ -5554,12 +5580,12 @@
       <w:numFmt w:val="none"/>
       <w:suff w:val="nothing"/>
       <w:lvlText w:val=""/>
-      <w:lvlJc w:val="start"/>
+      <w:lvlJc w:val="left"/>
       <w:pPr>
         <w:tabs>
           <w:tab w:val="num" w:pos="0"/>
         </w:tabs>
-        <w:ind w:start="0" w:hanging="0"/>
+        <w:ind w:left="0" w:hanging="0"/>
       </w:pPr>
     </w:lvl>
     <w:lvl w:ilvl="3">
@@ -5567,12 +5593,12 @@
       <w:numFmt w:val="none"/>
       <w:suff w:val="nothing"/>
       <w:lvlText w:val=""/>
-      <w:lvlJc w:val="start"/>
+      <w:lvlJc w:val="left"/>
       <w:pPr>
         <w:tabs>
           <w:tab w:val="num" w:pos="0"/>
         </w:tabs>
-        <w:ind w:start="0" w:hanging="0"/>
+        <w:ind w:left="0" w:hanging="0"/>
       </w:pPr>
     </w:lvl>
     <w:lvl w:ilvl="4">
@@ -5580,12 +5606,12 @@
       <w:numFmt w:val="none"/>
       <w:suff w:val="nothing"/>
       <w:lvlText w:val=""/>
-      <w:lvlJc w:val="start"/>
+      <w:lvlJc w:val="left"/>
       <w:pPr>
         <w:tabs>
           <w:tab w:val="num" w:pos="0"/>
         </w:tabs>
-        <w:ind w:start="0" w:hanging="0"/>
+        <w:ind w:left="0" w:hanging="0"/>
       </w:pPr>
     </w:lvl>
     <w:lvl w:ilvl="5">
@@ -5593,12 +5619,12 @@
       <w:numFmt w:val="none"/>
       <w:suff w:val="nothing"/>
       <w:lvlText w:val=""/>
-      <w:lvlJc w:val="start"/>
+      <w:lvlJc w:val="left"/>
       <w:pPr>
         <w:tabs>
           <w:tab w:val="num" w:pos="0"/>
         </w:tabs>
-        <w:ind w:start="0" w:hanging="0"/>
+        <w:ind w:left="0" w:hanging="0"/>
       </w:pPr>
     </w:lvl>
     <w:lvl w:ilvl="6">
@@ -5606,12 +5632,12 @@
       <w:numFmt w:val="none"/>
       <w:suff w:val="nothing"/>
       <w:lvlText w:val=""/>
-      <w:lvlJc w:val="start"/>
+      <w:lvlJc w:val="left"/>
       <w:pPr>
         <w:tabs>
           <w:tab w:val="num" w:pos="0"/>
         </w:tabs>
-        <w:ind w:start="0" w:hanging="0"/>
+        <w:ind w:left="0" w:hanging="0"/>
       </w:pPr>
     </w:lvl>
     <w:lvl w:ilvl="7">
@@ -5619,12 +5645,12 @@
       <w:numFmt w:val="none"/>
       <w:suff w:val="nothing"/>
       <w:lvlText w:val=""/>
-      <w:lvlJc w:val="start"/>
+      <w:lvlJc w:val="left"/>
       <w:pPr>
         <w:tabs>
           <w:tab w:val="num" w:pos="0"/>
         </w:tabs>
-        <w:ind w:start="0" w:hanging="0"/>
+        <w:ind w:left="0" w:hanging="0"/>
       </w:pPr>
     </w:lvl>
     <w:lvl w:ilvl="8">
@@ -5632,12 +5658,12 @@
       <w:numFmt w:val="none"/>
       <w:suff w:val="nothing"/>
       <w:lvlText w:val=""/>
-      <w:lvlJc w:val="start"/>
+      <w:lvlJc w:val="left"/>
       <w:pPr>
         <w:tabs>
           <w:tab w:val="num" w:pos="0"/>
         </w:tabs>
-        <w:ind w:start="0" w:hanging="0"/>
+        <w:ind w:left="0" w:hanging="0"/>
       </w:pPr>
     </w:lvl>
   </w:abstractNum>
@@ -6056,7 +6082,7 @@
       <w:suppressAutoHyphens w:val="true"/>
       <w:bidi w:val="0"/>
       <w:spacing w:before="0" w:after="0"/>
-      <w:jc w:val="start"/>
+      <w:jc w:val="left"/>
     </w:pPr>
     <w:rPr>
       <w:rFonts w:ascii="Times New Roman" w:hAnsi="Times New Roman" w:eastAsia="Times New Roman" w:cs="Times New Roman"/>
@@ -6068,7 +6094,7 @@
     </w:rPr>
   </w:style>
   <w:style w:type="paragraph" w:styleId="Heading1">
-    <w:name w:val="heading 1"/>
+    <w:name w:val="Heading 1"/>
     <w:basedOn w:val="Normal"/>
     <w:next w:val="Normal"/>
     <w:uiPriority w:val="9"/>
@@ -6086,7 +6112,7 @@
     </w:rPr>
   </w:style>
   <w:style w:type="paragraph" w:styleId="Heading2">
-    <w:name w:val="heading 2"/>
+    <w:name w:val="Heading 2"/>
     <w:basedOn w:val="Normal"/>
     <w:next w:val="Normal"/>
     <w:uiPriority w:val="9"/>
@@ -6106,7 +6132,7 @@
     </w:rPr>
   </w:style>
   <w:style w:type="paragraph" w:styleId="Heading3">
-    <w:name w:val="heading 3"/>
+    <w:name w:val="Heading 3"/>
     <w:basedOn w:val="Normal"/>
     <w:next w:val="Normal"/>
     <w:uiPriority w:val="9"/>
@@ -6126,7 +6152,7 @@
     </w:rPr>
   </w:style>
   <w:style w:type="paragraph" w:styleId="Heading4">
-    <w:name w:val="heading 4"/>
+    <w:name w:val="Heading 4"/>
     <w:basedOn w:val="Normal"/>
     <w:next w:val="Normal"/>
     <w:uiPriority w:val="9"/>
@@ -6144,7 +6170,7 @@
     </w:rPr>
   </w:style>
   <w:style w:type="paragraph" w:styleId="Heading5">
-    <w:name w:val="heading 5"/>
+    <w:name w:val="Heading 5"/>
     <w:basedOn w:val="Normal"/>
     <w:next w:val="Normal"/>
     <w:uiPriority w:val="9"/>
@@ -6164,7 +6190,7 @@
     </w:rPr>
   </w:style>
   <w:style w:type="paragraph" w:styleId="Heading6">
-    <w:name w:val="heading 6"/>
+    <w:name w:val="Heading 6"/>
     <w:basedOn w:val="Normal"/>
     <w:next w:val="Normal"/>
     <w:uiPriority w:val="9"/>
@@ -6235,7 +6261,6 @@
   <w:style w:type="character" w:styleId="TextocomentarioCar" w:customStyle="1">
     <w:name w:val="Texto comentario Car"/>
     <w:basedOn w:val="DefaultParagraphFont"/>
-    <w:link w:val="CommentText"/>
     <w:uiPriority w:val="99"/>
     <w:semiHidden/>
     <w:qFormat/>
@@ -6244,7 +6269,7 @@
       <w:szCs w:val="20"/>
     </w:rPr>
   </w:style>
-  <w:style w:type="character" w:styleId="CommentReference">
+  <w:style w:type="character" w:styleId="annotationreference">
     <w:name w:val="annotation reference"/>
     <w:basedOn w:val="DefaultParagraphFont"/>
     <w:uiPriority w:val="99"/>
@@ -6256,8 +6281,8 @@
       <w:szCs w:val="16"/>
     </w:rPr>
   </w:style>
-  <w:style w:type="paragraph" w:styleId="Heading" w:customStyle="1">
-    <w:name w:val="Heading"/>
+  <w:style w:type="paragraph" w:styleId="Ttulo" w:customStyle="1">
+    <w:name w:val="Título"/>
     <w:basedOn w:val="Normal"/>
     <w:next w:val="BodyText"/>
     <w:qFormat/>
@@ -6288,7 +6313,7 @@
     </w:rPr>
   </w:style>
   <w:style w:type="paragraph" w:styleId="Caption">
-    <w:name w:val="caption"/>
+    <w:name w:val="Caption"/>
     <w:basedOn w:val="Normal"/>
     <w:qFormat/>
     <w:pPr>
@@ -6301,8 +6326,8 @@
       <w:iCs/>
     </w:rPr>
   </w:style>
-  <w:style w:type="paragraph" w:styleId="Index" w:customStyle="1">
-    <w:name w:val="Index"/>
+  <w:style w:type="paragraph" w:styleId="ndice" w:customStyle="1">
+    <w:name w:val="Índice"/>
     <w:basedOn w:val="Normal"/>
     <w:qFormat/>
     <w:pPr>
@@ -6341,8 +6366,7 @@
       <w:suppressAutoHyphens w:val="true"/>
       <w:bidi w:val="0"/>
       <w:spacing w:lineRule="atLeast" w:line="1" w:before="0" w:after="0"/>
-      <w:ind w:hangingChars="1" w:startChars="-1"/>
-      <w:jc w:val="start"/>
+      <w:jc w:val="left"/>
       <w:textAlignment w:val="top"/>
       <w:outlineLvl w:val="0"/>
     </w:pPr>
@@ -6353,7 +6377,7 @@
       <w:position w:val="-1"/>
       <w:sz w:val="24"/>
       <w:szCs w:val="24"/>
-      <w:lang w:eastAsia="es-ES" w:val="es-ES" w:bidi="ar-SA"/>
+      <w:lang w:val="es-ES" w:eastAsia="es-ES" w:bidi="ar-SA"/>
     </w:rPr>
   </w:style>
   <w:style w:type="paragraph" w:styleId="Cuerpo" w:customStyle="1">
@@ -6364,7 +6388,6 @@
       <w:suppressAutoHyphens w:val="true"/>
       <w:bidi w:val="0"/>
       <w:spacing w:lineRule="atLeast" w:line="480" w:before="0" w:after="0"/>
-      <w:ind w:hangingChars="1" w:startChars="-1"/>
       <w:jc w:val="both"/>
       <w:textAlignment w:val="top"/>
       <w:outlineLvl w:val="0"/>
@@ -6376,18 +6399,18 @@
       <w:position w:val="-1"/>
       <w:sz w:val="24"/>
       <w:szCs w:val="24"/>
-      <w:lang w:eastAsia="es-ES" w:val="es-ES" w:bidi="ar-SA"/>
+      <w:lang w:val="es-ES" w:eastAsia="es-ES" w:bidi="ar-SA"/>
     </w:rPr>
   </w:style>
-  <w:style w:type="paragraph" w:styleId="HeaderandFooter" w:customStyle="1">
-    <w:name w:val="Header and Footer"/>
+  <w:style w:type="paragraph" w:styleId="Cabeceraypie" w:customStyle="1">
+    <w:name w:val="Cabecera y pie"/>
     <w:basedOn w:val="Normal"/>
     <w:qFormat/>
     <w:pPr/>
     <w:rPr/>
   </w:style>
   <w:style w:type="paragraph" w:styleId="Header">
-    <w:name w:val="header"/>
+    <w:name w:val="Header"/>
     <w:basedOn w:val="Normal"/>
     <w:pPr>
       <w:tabs>
@@ -6396,7 +6419,6 @@
         <w:tab w:val="right" w:pos="8504" w:leader="none"/>
       </w:tabs>
       <w:spacing w:lineRule="atLeast" w:line="1"/>
-      <w:ind w:hangingChars="1" w:startChars="-1"/>
       <w:textAlignment w:val="top"/>
       <w:outlineLvl w:val="0"/>
     </w:pPr>
@@ -6424,8 +6446,8 @@
       <w:szCs w:val="48"/>
     </w:rPr>
   </w:style>
-  <w:style w:type="paragraph" w:styleId="CommentText">
-    <w:name w:val="annotation text"/>
+  <w:style w:type="paragraph" w:styleId="AnnotationText">
+    <w:name w:val="Annotation Text"/>
     <w:basedOn w:val="Normal"/>
     <w:link w:val="TextocomentarioCar"/>
     <w:uiPriority w:val="99"/>
@@ -6445,19 +6467,19 @@
     <w:rsid w:val="000350f4"/>
     <w:pPr>
       <w:spacing w:before="0" w:after="0"/>
-      <w:ind w:start="720"/>
+      <w:ind w:left="720"/>
       <w:contextualSpacing/>
     </w:pPr>
     <w:rPr/>
   </w:style>
   <w:style w:type="paragraph" w:styleId="Footer">
-    <w:name w:val="footer"/>
-    <w:basedOn w:val="HeaderandFooter"/>
+    <w:name w:val="Footer"/>
+    <w:basedOn w:val="Cabeceraypie"/>
     <w:pPr/>
     <w:rPr/>
   </w:style>
-  <w:style w:type="numbering" w:styleId="NoList" w:default="1">
-    <w:name w:val="No List"/>
+  <w:style w:type="numbering" w:styleId="Ningunalista" w:default="1">
+    <w:name w:val="Ninguna lista"/>
     <w:uiPriority w:val="99"/>
     <w:semiHidden/>
     <w:unhideWhenUsed/>

</xml_diff>